<commit_message>
feat: enrich resume content and redesign web style
</commit_message>
<xml_diff>
--- a/word/吴志勇-IT运维工程师-一页版.docx
+++ b/word/吴志勇-IT运维工程师-一页版.docx
@@ -5,22 +5,22 @@
     <w:tbl>
       <w:tblPr>
         <w:tblStyle w:val="TableGrid"/>
-        <w:tblW w:type="dxa" w:w="10998"/>
+        <w:tblW w:type="dxa" w:w="11112"/>
         <w:jc w:val="left"/>
         <w:tblLayout w:type="fixed"/>
         <w:tblLook w:firstColumn="1" w:firstRow="1" w:lastColumn="0" w:lastRow="0" w:noHBand="0" w:noVBand="1" w:val="04A0"/>
       </w:tblPr>
       <w:tblGrid>
-        <w:gridCol w:w="9184"/>
+        <w:gridCol w:w="9298"/>
         <w:gridCol w:w="1814"/>
       </w:tblGrid>
       <w:tr>
         <w:trPr>
-          <w:trHeight w:val="1814" w:hRule="atLeast"/>
+          <w:trHeight w:val="1587" w:hRule="atLeast"/>
         </w:trPr>
         <w:tc>
           <w:tcPr>
-            <w:tcW w:type="dxa" w:w="9184"/>
+            <w:tcW w:type="dxa" w:w="9298"/>
             <w:vAlign w:val="center"/>
           </w:tcPr>
           <w:p>
@@ -33,7 +33,7 @@
                 <w:rFonts w:ascii="微软雅黑" w:hAnsi="微软雅黑" w:eastAsia="微软雅黑"/>
                 <w:b/>
                 <w:i w:val="0"/>
-                <w:color w:val="0B3B36"/>
+                <w:color w:val="111820"/>
                 <w:sz w:val="44"/>
               </w:rPr>
               <w:t>吴志勇</w:t>
@@ -48,10 +48,10 @@
                 <w:rFonts w:ascii="微软雅黑" w:hAnsi="微软雅黑" w:eastAsia="微软雅黑"/>
                 <w:b/>
                 <w:i w:val="0"/>
-                <w:color w:val="0F766E"/>
+                <w:color w:val="0E7490"/>
                 <w:sz w:val="22"/>
               </w:rPr>
-              <w:t>IT运维工程师 · 桌面运维 / 轻量开发 / AI 应用</w:t>
+              <w:t>IT运维工程师 · 桌面运维 / 自动化 / AI 应用</w:t>
             </w:r>
           </w:p>
           <w:p>
@@ -63,7 +63,7 @@
                 <w:rFonts w:ascii="微软雅黑" w:hAnsi="微软雅黑" w:eastAsia="微软雅黑"/>
                 <w:b w:val="0"/>
                 <w:i w:val="0"/>
-                <w:color w:val="5D6D76"/>
+                <w:color w:val="5C6B76"/>
                 <w:sz w:val="17"/>
               </w:rPr>
               <w:t>电话：19170245568　邮箱：2268562600@qq.com</w:t>
@@ -78,10 +78,25 @@
                 <w:rFonts w:ascii="微软雅黑" w:hAnsi="微软雅黑" w:eastAsia="微软雅黑"/>
                 <w:b w:val="0"/>
                 <w:i w:val="0"/>
-                <w:color w:val="5D6D76"/>
+                <w:color w:val="5C6B76"/>
                 <w:sz w:val="17"/>
               </w:rPr>
               <w:t>微信：19170245568　城市：福建宁德</w:t>
+            </w:r>
+          </w:p>
+          <w:p>
+            <w:pPr>
+              <w:spacing w:after="0" w:line="324" w:lineRule="auto"/>
+            </w:pPr>
+            <w:r>
+              <w:rPr>
+                <w:rFonts w:ascii="微软雅黑" w:hAnsi="微软雅黑" w:eastAsia="微软雅黑"/>
+                <w:b w:val="0"/>
+                <w:i w:val="0"/>
+                <w:color w:val="5C6B76"/>
+                <w:sz w:val="17"/>
+              </w:rPr>
+              <w:t>政治面貌：中共党员　籍贯：江西九江　出生年月：2002.08</w:t>
             </w:r>
           </w:p>
         </w:tc>
@@ -100,7 +115,7 @@
                 <w:rFonts w:ascii="微软雅黑" w:hAnsi="微软雅黑" w:eastAsia="微软雅黑"/>
                 <w:b/>
                 <w:i w:val="0"/>
-                <w:color w:val="5D6D76"/>
+                <w:color w:val="5C6B76"/>
                 <w:sz w:val="22"/>
               </w:rPr>
               <w:t>照片</w:t>
@@ -116,7 +131,7 @@
                 <w:rFonts w:ascii="微软雅黑" w:hAnsi="微软雅黑" w:eastAsia="微软雅黑"/>
                 <w:b w:val="0"/>
                 <w:i w:val="0"/>
-                <w:color w:val="5D6D76"/>
+                <w:color w:val="5C6B76"/>
                 <w:sz w:val="16"/>
               </w:rPr>
               <w:t>3.0 × 4.0 cm</w:t>
@@ -129,7 +144,7 @@
       <w:pPr>
         <w:spacing w:before="40" w:after="60" w:line="240" w:lineRule="auto"/>
         <w:pBdr>
-          <w:bottom w:val="single" w:sz="8" w:space="4" w:color="B7D3CF"/>
+          <w:bottom w:val="single" w:sz="8" w:space="4" w:color="B8DCE6"/>
         </w:pBdr>
       </w:pPr>
       <w:r>
@@ -137,7 +152,7 @@
           <w:rFonts w:ascii="微软雅黑" w:hAnsi="微软雅黑" w:eastAsia="微软雅黑"/>
           <w:b/>
           <w:i w:val="0"/>
-          <w:color w:val="115E59"/>
+          <w:color w:val="155E75"/>
           <w:sz w:val="24"/>
         </w:rPr>
         <w:t>个人定位</w:t>
@@ -145,24 +160,24 @@
     </w:p>
     <w:p>
       <w:pPr>
-        <w:spacing w:before="0" w:after="20" w:line="274" w:lineRule="auto"/>
+        <w:spacing w:before="0" w:after="10" w:line="264" w:lineRule="auto"/>
       </w:pPr>
       <w:r>
         <w:rPr>
           <w:rFonts w:ascii="微软雅黑" w:hAnsi="微软雅黑" w:eastAsia="微软雅黑"/>
           <w:b w:val="0"/>
           <w:i w:val="0"/>
-          <w:color w:val="17222A"/>
-          <w:sz w:val="19"/>
+          <w:color w:val="101820"/>
+          <w:sz w:val="18"/>
         </w:rPr>
-        <w:t>一年宁德新能源 IDT 部门 IT 运维经验，桌面运维扎实，擅长 Python 自动化与轻量网页开发，熟悉 AI 大模型接入与办公场景落地；习惯把零散运维场景 SOP 化、标准化、数字化。</w:t>
+        <w:t>一年宁德新能源 IT 运维经验 + 半年硬件测试背景。桌面运维扎实，擅长 Python 自动化与轻量网页开发，熟悉 AI 大模型接入；习惯把零散运维场景 SOP 化、标准化、数字化。</w:t>
       </w:r>
     </w:p>
     <w:p>
       <w:pPr>
         <w:spacing w:before="60" w:after="60" w:line="240" w:lineRule="auto"/>
         <w:pBdr>
-          <w:bottom w:val="single" w:sz="8" w:space="4" w:color="B7D3CF"/>
+          <w:bottom w:val="single" w:sz="8" w:space="4" w:color="B8DCE6"/>
         </w:pBdr>
       </w:pPr>
       <w:r>
@@ -170,7 +185,7 @@
           <w:rFonts w:ascii="微软雅黑" w:hAnsi="微软雅黑" w:eastAsia="微软雅黑"/>
           <w:b/>
           <w:i w:val="0"/>
-          <w:color w:val="115E59"/>
+          <w:color w:val="155E75"/>
           <w:sz w:val="24"/>
         </w:rPr>
         <w:t>核心成果</w:t>
@@ -179,7 +194,7 @@
     <w:p>
       <w:pPr>
         <w:pStyle w:val="ListBullet"/>
-        <w:spacing w:before="0" w:after="20" w:line="269" w:lineRule="auto"/>
+        <w:spacing w:before="0" w:after="10" w:line="252" w:lineRule="auto"/>
         <w:ind w:left="312" w:hanging="142"/>
       </w:pPr>
       <w:r>
@@ -187,8 +202,8 @@
           <w:rFonts w:ascii="微软雅黑" w:hAnsi="微软雅黑" w:eastAsia="微软雅黑"/>
           <w:b w:val="0"/>
           <w:i w:val="0"/>
-          <w:color w:val="17222A"/>
-          <w:sz w:val="19"/>
+          <w:color w:val="101820"/>
+          <w:sz w:val="18"/>
         </w:rPr>
         <w:t>一周独立完成 200+ 台校招 PC 标准化配置交付，零设备故障、零兼容问题。</w:t>
       </w:r>
@@ -196,7 +211,7 @@
     <w:p>
       <w:pPr>
         <w:pStyle w:val="ListBullet"/>
-        <w:spacing w:before="0" w:after="20" w:line="269" w:lineRule="auto"/>
+        <w:spacing w:before="0" w:after="10" w:line="252" w:lineRule="auto"/>
         <w:ind w:left="312" w:hanging="142"/>
       </w:pPr>
       <w:r>
@@ -204,8 +219,8 @@
           <w:rFonts w:ascii="微软雅黑" w:hAnsi="微软雅黑" w:eastAsia="微软雅黑"/>
           <w:b w:val="0"/>
           <w:i w:val="0"/>
-          <w:color w:val="17222A"/>
-          <w:sz w:val="19"/>
+          <w:color w:val="101820"/>
+          <w:sz w:val="18"/>
         </w:rPr>
         <w:t>自研打印机智能监控系统，设备故障响应时长缩短 90% 以上。</w:t>
       </w:r>
@@ -213,7 +228,7 @@
     <w:p>
       <w:pPr>
         <w:pStyle w:val="ListBullet"/>
-        <w:spacing w:before="0" w:after="20" w:line="269" w:lineRule="auto"/>
+        <w:spacing w:before="0" w:after="10" w:line="252" w:lineRule="auto"/>
         <w:ind w:left="312" w:hanging="142"/>
       </w:pPr>
       <w:r>
@@ -221,8 +236,8 @@
           <w:rFonts w:ascii="微软雅黑" w:hAnsi="微软雅黑" w:eastAsia="微软雅黑"/>
           <w:b w:val="0"/>
           <w:i w:val="0"/>
-          <w:color w:val="17222A"/>
-          <w:sz w:val="19"/>
+          <w:color w:val="101820"/>
+          <w:sz w:val="18"/>
         </w:rPr>
         <w:t>主导 IT 仓库数字化改造，资产盘点效率提升 70% 以上。</w:t>
       </w:r>
@@ -230,7 +245,7 @@
     <w:p>
       <w:pPr>
         <w:pStyle w:val="ListBullet"/>
-        <w:spacing w:before="0" w:after="20" w:line="269" w:lineRule="auto"/>
+        <w:spacing w:before="0" w:after="10" w:line="252" w:lineRule="auto"/>
         <w:ind w:left="312" w:hanging="142"/>
       </w:pPr>
       <w:r>
@@ -238,17 +253,17 @@
           <w:rFonts w:ascii="微软雅黑" w:hAnsi="微软雅黑" w:eastAsia="微软雅黑"/>
           <w:b w:val="0"/>
           <w:i w:val="0"/>
-          <w:color w:val="17222A"/>
-          <w:sz w:val="19"/>
+          <w:color w:val="101820"/>
+          <w:sz w:val="18"/>
         </w:rPr>
-        <w:t>自研苹果文件转换工具，跨系统文件转换效率提升 80%。</w:t>
+        <w:t>自研苹果文件转换等工具，跨系统文件转换效率提升 80%。</w:t>
       </w:r>
     </w:p>
     <w:p>
       <w:pPr>
         <w:spacing w:before="60" w:after="60" w:line="240" w:lineRule="auto"/>
         <w:pBdr>
-          <w:bottom w:val="single" w:sz="8" w:space="4" w:color="B7D3CF"/>
+          <w:bottom w:val="single" w:sz="8" w:space="4" w:color="B8DCE6"/>
         </w:pBdr>
       </w:pPr>
       <w:r>
@@ -256,7 +271,7 @@
           <w:rFonts w:ascii="微软雅黑" w:hAnsi="微软雅黑" w:eastAsia="微软雅黑"/>
           <w:b/>
           <w:i w:val="0"/>
-          <w:color w:val="115E59"/>
+          <w:color w:val="155E75"/>
           <w:sz w:val="24"/>
         </w:rPr>
         <w:t>工作经历</w:t>
@@ -271,7 +286,7 @@
           <w:rFonts w:ascii="微软雅黑" w:hAnsi="微软雅黑" w:eastAsia="微软雅黑"/>
           <w:b/>
           <w:i w:val="0"/>
-          <w:color w:val="17222A"/>
+          <w:color w:val="101820"/>
           <w:sz w:val="20"/>
         </w:rPr>
         <w:t>桌面运维资深技术员</w:t>
@@ -281,7 +296,7 @@
           <w:rFonts w:ascii="微软雅黑" w:hAnsi="微软雅黑" w:eastAsia="微软雅黑"/>
           <w:b w:val="0"/>
           <w:i w:val="0"/>
-          <w:color w:val="5D6D76"/>
+          <w:color w:val="5C6B76"/>
           <w:sz w:val="19"/>
         </w:rPr>
         <w:t xml:space="preserve">　宁德新能源科技有限公司 · IDT 部门 · 2025.07 - 至今</w:t>
@@ -290,7 +305,7 @@
     <w:p>
       <w:pPr>
         <w:pStyle w:val="ListBullet"/>
-        <w:spacing w:before="0" w:after="20" w:line="269" w:lineRule="auto"/>
+        <w:spacing w:before="0" w:after="10" w:line="252" w:lineRule="auto"/>
         <w:ind w:left="312" w:hanging="142"/>
       </w:pPr>
       <w:r>
@@ -298,16 +313,16 @@
           <w:rFonts w:ascii="微软雅黑" w:hAnsi="微软雅黑" w:eastAsia="微软雅黑"/>
           <w:b w:val="0"/>
           <w:i w:val="0"/>
-          <w:color w:val="17222A"/>
-          <w:sz w:val="19"/>
+          <w:color w:val="101820"/>
+          <w:sz w:val="18"/>
         </w:rPr>
-        <w:t>Windows 终端全域运维、办公软件批量部署、系统与软硬件异常排查，梳理全套运维 SOP 与知识库。</w:t>
+        <w:t>Windows 终端运维、装机自动化与批量部署，负责 IT 仓库设备配置与退仓检测，日均出仓约 40 台；SecureCRT 完成会议室 VLAN 规划。</w:t>
       </w:r>
     </w:p>
     <w:p>
       <w:pPr>
         <w:pStyle w:val="ListBullet"/>
-        <w:spacing w:before="0" w:after="20" w:line="269" w:lineRule="auto"/>
+        <w:spacing w:before="0" w:after="10" w:line="252" w:lineRule="auto"/>
         <w:ind w:left="312" w:hanging="142"/>
       </w:pPr>
       <w:r>
@@ -315,16 +330,16 @@
           <w:rFonts w:ascii="微软雅黑" w:hAnsi="微软雅黑" w:eastAsia="微软雅黑"/>
           <w:b w:val="0"/>
           <w:i w:val="0"/>
-          <w:color w:val="17222A"/>
-          <w:sz w:val="19"/>
+          <w:color w:val="101820"/>
+          <w:sz w:val="18"/>
         </w:rPr>
-        <w:t>基于 Python 开发打印机智能监控、苹果文件转换等内部工具，对接飞书机器人实现自动告警。</w:t>
+        <w:t>Python 自研打印机监控、文件快搜、苹果转换、域账号一键改密等工具，对接飞书机器人自动告警。</w:t>
       </w:r>
     </w:p>
     <w:p>
       <w:pPr>
         <w:pStyle w:val="ListBullet"/>
-        <w:spacing w:before="0" w:after="20" w:line="269" w:lineRule="auto"/>
+        <w:spacing w:before="0" w:after="10" w:line="252" w:lineRule="auto"/>
         <w:ind w:left="312" w:hanging="142"/>
       </w:pPr>
       <w:r>
@@ -332,34 +347,32 @@
           <w:rFonts w:ascii="微软雅黑" w:hAnsi="微软雅黑" w:eastAsia="微软雅黑"/>
           <w:b w:val="0"/>
           <w:i w:val="0"/>
-          <w:color w:val="17222A"/>
-          <w:sz w:val="19"/>
+          <w:color w:val="101820"/>
+          <w:sz w:val="18"/>
         </w:rPr>
-        <w:t>主导 IT 仓库数字化改造与资产全生命周期管理，落地自助导航与实景可视化方案。</w:t>
+        <w:t>主导 IT 仓库数字化、资产全生命周期、内网导航页面与 AI 大模型接入，沉淀全套 SOP 与知识库。</w:t>
       </w:r>
     </w:p>
     <w:p>
       <w:pPr>
-        <w:pStyle w:val="ListBullet"/>
-        <w:spacing w:before="0" w:after="20" w:line="269" w:lineRule="auto"/>
-        <w:ind w:left="312" w:hanging="142"/>
+        <w:spacing w:before="0" w:after="10" w:line="252" w:lineRule="auto"/>
       </w:pPr>
       <w:r>
         <w:rPr>
           <w:rFonts w:ascii="微软雅黑" w:hAnsi="微软雅黑" w:eastAsia="微软雅黑"/>
           <w:b w:val="0"/>
           <w:i w:val="0"/>
-          <w:color w:val="17222A"/>
-          <w:sz w:val="19"/>
+          <w:color w:val="101820"/>
+          <w:sz w:val="18"/>
         </w:rPr>
-        <w:t>基于公司内网制作导航类 HTML 页面；完成 AI 大模型 API 接入、客户端部署与参数调试。</w:t>
+        <w:t>2025.03 - 2025.07　湖北合力源电子技术有限公司 · 硬件测试工程师：驻点武汉理工大学，完成新车型胎压测试项目，负责线束制作、程序烧录、路测数据采集与 MATLAB 数据分析。</w:t>
       </w:r>
     </w:p>
     <w:p>
       <w:pPr>
         <w:spacing w:before="60" w:after="60" w:line="240" w:lineRule="auto"/>
         <w:pBdr>
-          <w:bottom w:val="single" w:sz="8" w:space="4" w:color="B7D3CF"/>
+          <w:bottom w:val="single" w:sz="8" w:space="4" w:color="B8DCE6"/>
         </w:pBdr>
       </w:pPr>
       <w:r>
@@ -367,7 +380,7 @@
           <w:rFonts w:ascii="微软雅黑" w:hAnsi="微软雅黑" w:eastAsia="微软雅黑"/>
           <w:b/>
           <w:i w:val="0"/>
-          <w:color w:val="115E59"/>
+          <w:color w:val="155E75"/>
           <w:sz w:val="24"/>
         </w:rPr>
         <w:t>项目经历</w:t>
@@ -382,7 +395,7 @@
           <w:rFonts w:ascii="微软雅黑" w:hAnsi="微软雅黑" w:eastAsia="微软雅黑"/>
           <w:b/>
           <w:i w:val="0"/>
-          <w:color w:val="17222A"/>
+          <w:color w:val="101820"/>
           <w:sz w:val="20"/>
         </w:rPr>
         <w:t>打印机智能监控自动化系统</w:t>
@@ -392,7 +405,7 @@
           <w:rFonts w:ascii="微软雅黑" w:hAnsi="微软雅黑" w:eastAsia="微软雅黑"/>
           <w:b w:val="0"/>
           <w:i w:val="0"/>
-          <w:color w:val="5D6D76"/>
+          <w:color w:val="5C6B76"/>
           <w:sz w:val="19"/>
         </w:rPr>
         <w:t xml:space="preserve">　Python / 飞书 API</w:t>
@@ -401,7 +414,7 @@
     <w:p>
       <w:pPr>
         <w:pStyle w:val="ListBullet"/>
-        <w:spacing w:before="0" w:after="20" w:line="269" w:lineRule="auto"/>
+        <w:spacing w:before="0" w:after="10" w:line="252" w:lineRule="auto"/>
         <w:ind w:left="312" w:hanging="142"/>
       </w:pPr>
       <w:r>
@@ -409,10 +422,10 @@
           <w:rFonts w:ascii="微软雅黑" w:hAnsi="微软雅黑" w:eastAsia="微软雅黑"/>
           <w:b w:val="0"/>
           <w:i w:val="0"/>
-          <w:color w:val="17222A"/>
-          <w:sz w:val="19"/>
+          <w:color w:val="101820"/>
+          <w:sz w:val="18"/>
         </w:rPr>
-        <w:t>抓取解析数据库设备运行数据，飞书机器人实时告警，故障响应时长缩短 90% 以上。</w:t>
+        <w:t>数据库数据抓取与解析，飞书机器人实时告警，故障响应时长缩短 90% 以上。</w:t>
       </w:r>
     </w:p>
     <w:p>
@@ -424,26 +437,26 @@
           <w:rFonts w:ascii="微软雅黑" w:hAnsi="微软雅黑" w:eastAsia="微软雅黑"/>
           <w:b/>
           <w:i w:val="0"/>
-          <w:color w:val="17222A"/>
+          <w:color w:val="101820"/>
           <w:sz w:val="20"/>
         </w:rPr>
-        <w:t>苹果文件格式转换工具</w:t>
+        <w:t>装机自动化与办公工具集</w:t>
       </w:r>
       <w:r>
         <w:rPr>
           <w:rFonts w:ascii="微软雅黑" w:hAnsi="微软雅黑" w:eastAsia="微软雅黑"/>
           <w:b w:val="0"/>
           <w:i w:val="0"/>
-          <w:color w:val="5D6D76"/>
+          <w:color w:val="5C6B76"/>
           <w:sz w:val="19"/>
         </w:rPr>
-        <w:t xml:space="preserve">　Python</w:t>
+        <w:t xml:space="preserve">　Python / 自动化脚本</w:t>
       </w:r>
     </w:p>
     <w:p>
       <w:pPr>
         <w:pStyle w:val="ListBullet"/>
-        <w:spacing w:before="0" w:after="20" w:line="269" w:lineRule="auto"/>
+        <w:spacing w:before="0" w:after="10" w:line="252" w:lineRule="auto"/>
         <w:ind w:left="312" w:hanging="142"/>
       </w:pPr>
       <w:r>
@@ -451,10 +464,10 @@
           <w:rFonts w:ascii="微软雅黑" w:hAnsi="微软雅黑" w:eastAsia="微软雅黑"/>
           <w:b w:val="0"/>
           <w:i w:val="0"/>
-          <w:color w:val="17222A"/>
-          <w:sz w:val="19"/>
+          <w:color w:val="101820"/>
+          <w:sz w:val="18"/>
         </w:rPr>
-        <w:t>Mac/Windows 文件一键批量转换，本地安全处理，员工文件转换效率提升 80%。</w:t>
+        <w:t>装机自动化脚本支撑日均出仓约 40 台；自研文件快搜、苹果文件转换、域账号一键改密。</w:t>
       </w:r>
     </w:p>
     <w:p>
@@ -466,7 +479,7 @@
           <w:rFonts w:ascii="微软雅黑" w:hAnsi="微软雅黑" w:eastAsia="微软雅黑"/>
           <w:b/>
           <w:i w:val="0"/>
-          <w:color w:val="17222A"/>
+          <w:color w:val="101820"/>
           <w:sz w:val="20"/>
         </w:rPr>
         <w:t>IT 仓库数字化升级与资产全生命周期管理</w:t>
@@ -476,7 +489,7 @@
           <w:rFonts w:ascii="微软雅黑" w:hAnsi="微软雅黑" w:eastAsia="微软雅黑"/>
           <w:b w:val="0"/>
           <w:i w:val="0"/>
-          <w:color w:val="5D6D76"/>
+          <w:color w:val="5C6B76"/>
           <w:sz w:val="19"/>
         </w:rPr>
         <w:t xml:space="preserve">　资产台账 / SOP</w:t>
@@ -485,7 +498,7 @@
     <w:p>
       <w:pPr>
         <w:pStyle w:val="ListBullet"/>
-        <w:spacing w:before="0" w:after="20" w:line="269" w:lineRule="auto"/>
+        <w:spacing w:before="0" w:after="10" w:line="252" w:lineRule="auto"/>
         <w:ind w:left="312" w:hanging="142"/>
       </w:pPr>
       <w:r>
@@ -493,41 +506,34 @@
           <w:rFonts w:ascii="微软雅黑" w:hAnsi="微软雅黑" w:eastAsia="微软雅黑"/>
           <w:b w:val="0"/>
           <w:i w:val="0"/>
-          <w:color w:val="17222A"/>
-          <w:sz w:val="19"/>
+          <w:color w:val="101820"/>
+          <w:sz w:val="18"/>
         </w:rPr>
         <w:t>全流程 SOP + 数字化台账 + 可视化导航，资产盘点效率提升 70% 以上。</w:t>
       </w:r>
     </w:p>
     <w:p>
       <w:pPr>
-        <w:spacing w:before="40" w:after="40" w:line="264" w:lineRule="auto"/>
+        <w:spacing w:before="60" w:after="60" w:line="240" w:lineRule="auto"/>
+        <w:pBdr>
+          <w:bottom w:val="single" w:sz="8" w:space="4" w:color="B8DCE6"/>
+        </w:pBdr>
       </w:pPr>
       <w:r>
         <w:rPr>
           <w:rFonts w:ascii="微软雅黑" w:hAnsi="微软雅黑" w:eastAsia="微软雅黑"/>
           <w:b/>
           <w:i w:val="0"/>
-          <w:color w:val="17222A"/>
-          <w:sz w:val="20"/>
+          <w:color w:val="155E75"/>
+          <w:sz w:val="24"/>
         </w:rPr>
-        <w:t>企业 AI 大模型能力接入与落地</w:t>
-      </w:r>
-      <w:r>
-        <w:rPr>
-          <w:rFonts w:ascii="微软雅黑" w:hAnsi="微软雅黑" w:eastAsia="微软雅黑"/>
-          <w:b w:val="0"/>
-          <w:i w:val="0"/>
-          <w:color w:val="5D6D76"/>
-          <w:sz w:val="19"/>
-        </w:rPr>
-        <w:t xml:space="preserve">　API 接入 / 部署调试</w:t>
+        <w:t>专业技能与证书</w:t>
       </w:r>
     </w:p>
     <w:p>
       <w:pPr>
         <w:pStyle w:val="ListBullet"/>
-        <w:spacing w:before="0" w:after="20" w:line="269" w:lineRule="auto"/>
+        <w:spacing w:before="0" w:after="10" w:line="252" w:lineRule="auto"/>
         <w:ind w:left="312" w:hanging="142"/>
       </w:pPr>
       <w:r>
@@ -535,17 +541,51 @@
           <w:rFonts w:ascii="微软雅黑" w:hAnsi="微软雅黑" w:eastAsia="微软雅黑"/>
           <w:b w:val="0"/>
           <w:i w:val="0"/>
-          <w:color w:val="17222A"/>
-          <w:sz w:val="19"/>
+          <w:color w:val="101820"/>
+          <w:sz w:val="18"/>
         </w:rPr>
-        <w:t>多厂商模型接入、部署调试与异常排错，打通企业内部 AI 应用通道。</w:t>
+        <w:t>桌面运维与网络：Windows 终端运维、批量部署、会议室 VLAN、退仓检测、办公外设运维。</w:t>
+      </w:r>
+    </w:p>
+    <w:p>
+      <w:pPr>
+        <w:pStyle w:val="ListBullet"/>
+        <w:spacing w:before="0" w:after="10" w:line="252" w:lineRule="auto"/>
+        <w:ind w:left="312" w:hanging="142"/>
+      </w:pPr>
+      <w:r>
+        <w:rPr>
+          <w:rFonts w:ascii="微软雅黑" w:hAnsi="微软雅黑" w:eastAsia="微软雅黑"/>
+          <w:b w:val="0"/>
+          <w:i w:val="0"/>
+          <w:color w:val="101820"/>
+          <w:sz w:val="18"/>
+        </w:rPr>
+        <w:t>开发与数据：Python、C、SQL、MATLAB、飞书 API、HTML/CSS、Agent 与工作流。</w:t>
+      </w:r>
+    </w:p>
+    <w:p>
+      <w:pPr>
+        <w:pStyle w:val="ListBullet"/>
+        <w:spacing w:before="0" w:after="10" w:line="252" w:lineRule="auto"/>
+        <w:ind w:left="312" w:hanging="142"/>
+      </w:pPr>
+      <w:r>
+        <w:rPr>
+          <w:rFonts w:ascii="微软雅黑" w:hAnsi="微软雅黑" w:eastAsia="微软雅黑"/>
+          <w:b w:val="0"/>
+          <w:i w:val="0"/>
+          <w:color w:val="101820"/>
+          <w:sz w:val="18"/>
+        </w:rPr>
+        <w:t>资产与 AI：资产全生命周期、SOP、知识库、AI 大模型接入；证书：CET-4、高低压电工证、AutoCAD、5G 承载网络运维（中级）。</w:t>
       </w:r>
     </w:p>
     <w:p>
       <w:pPr>
         <w:spacing w:before="60" w:after="60" w:line="240" w:lineRule="auto"/>
         <w:pBdr>
-          <w:bottom w:val="single" w:sz="8" w:space="4" w:color="B7D3CF"/>
+          <w:bottom w:val="single" w:sz="8" w:space="4" w:color="B8DCE6"/>
         </w:pBdr>
       </w:pPr>
       <w:r>
@@ -553,131 +593,60 @@
           <w:rFonts w:ascii="微软雅黑" w:hAnsi="微软雅黑" w:eastAsia="微软雅黑"/>
           <w:b/>
           <w:i w:val="0"/>
-          <w:color w:val="115E59"/>
+          <w:color w:val="155E75"/>
           <w:sz w:val="24"/>
         </w:rPr>
-        <w:t>专业技能</w:t>
+        <w:t>其他经历、荣誉与教育</w:t>
       </w:r>
     </w:p>
     <w:p>
       <w:pPr>
-        <w:pStyle w:val="ListBullet"/>
-        <w:spacing w:before="0" w:after="20" w:line="269" w:lineRule="auto"/>
-        <w:ind w:left="312" w:hanging="142"/>
+        <w:spacing w:before="0" w:after="10" w:line="252" w:lineRule="auto"/>
       </w:pPr>
       <w:r>
         <w:rPr>
           <w:rFonts w:ascii="微软雅黑" w:hAnsi="微软雅黑" w:eastAsia="微软雅黑"/>
           <w:b w:val="0"/>
           <w:i w:val="0"/>
-          <w:color w:val="17222A"/>
-          <w:sz w:val="19"/>
+          <w:color w:val="101820"/>
+          <w:sz w:val="18"/>
         </w:rPr>
-        <w:t>桌面运维与批量部署：Windows 终端运维、系统/软件异常排查、PC 硬件辨识、批量装机与标准化部署、办公外设运维。</w:t>
+        <w:t>2023.06 - 2023.09　猿起（武汉）科技有限公司 · 班主任兼销售：每周服务 60+ 客户，多期销售榜前列，月均 GMV 约 2 万。</w:t>
       </w:r>
     </w:p>
     <w:p>
       <w:pPr>
-        <w:pStyle w:val="ListBullet"/>
-        <w:spacing w:before="0" w:after="20" w:line="269" w:lineRule="auto"/>
-        <w:ind w:left="312" w:hanging="142"/>
+        <w:spacing w:before="0" w:after="10" w:line="252" w:lineRule="auto"/>
       </w:pPr>
       <w:r>
         <w:rPr>
           <w:rFonts w:ascii="微软雅黑" w:hAnsi="微软雅黑" w:eastAsia="微软雅黑"/>
           <w:b w:val="0"/>
           <w:i w:val="0"/>
-          <w:color w:val="17222A"/>
-          <w:sz w:val="19"/>
+          <w:color w:val="101820"/>
+          <w:sz w:val="18"/>
         </w:rPr>
-        <w:t>自动化与开发：Python 自动化、数据抓取与解析、飞书机器人 API、轻量 HTML/CSS 页面、内部工具自研。</w:t>
+        <w:t>2023.09 - 2025.06　班长兼学习委员；2021.10 - 2022.11　青年志愿者协会会长。</w:t>
       </w:r>
     </w:p>
     <w:p>
       <w:pPr>
-        <w:pStyle w:val="ListBullet"/>
-        <w:spacing w:before="0" w:after="20" w:line="269" w:lineRule="auto"/>
-        <w:ind w:left="312" w:hanging="142"/>
+        <w:spacing w:before="0" w:after="10" w:line="252" w:lineRule="auto"/>
       </w:pPr>
       <w:r>
         <w:rPr>
           <w:rFonts w:ascii="微软雅黑" w:hAnsi="微软雅黑" w:eastAsia="微软雅黑"/>
           <w:b w:val="0"/>
           <w:i w:val="0"/>
-          <w:color w:val="17222A"/>
-          <w:sz w:val="19"/>
+          <w:color w:val="101820"/>
+          <w:sz w:val="18"/>
         </w:rPr>
-        <w:t>资产与流程：IT 资产全生命周期管理、仓库数字化、SOP 标准化、知识库搭建、需求对接与项目落地。</w:t>
+        <w:t>2021.09 - 2025.06　武汉东湖学院 · 通信工程 · 本科；成绩专业第一、连续两年国家励志奖学金；大唐杯全国一等奖、数学建模省级一等奖等。</w:t>
       </w:r>
     </w:p>
     <w:p>
       <w:pPr>
-        <w:pStyle w:val="ListBullet"/>
-        <w:spacing w:before="0" w:after="20" w:line="269" w:lineRule="auto"/>
-        <w:ind w:left="312" w:hanging="142"/>
-      </w:pPr>
-      <w:r>
-        <w:rPr>
-          <w:rFonts w:ascii="微软雅黑" w:hAnsi="微软雅黑" w:eastAsia="微软雅黑"/>
-          <w:b w:val="0"/>
-          <w:i w:val="0"/>
-          <w:color w:val="17222A"/>
-          <w:sz w:val="19"/>
-        </w:rPr>
-        <w:t>AI 应用：大模型 API 接入、客户端部署、密钥与权限调试、异常排错、办公场景落地。</w:t>
-      </w:r>
-    </w:p>
-    <w:p>
-      <w:pPr>
-        <w:spacing w:before="60" w:after="60" w:line="240" w:lineRule="auto"/>
-        <w:pBdr>
-          <w:bottom w:val="single" w:sz="8" w:space="4" w:color="B7D3CF"/>
-        </w:pBdr>
-      </w:pPr>
-      <w:r>
-        <w:rPr>
-          <w:rFonts w:ascii="微软雅黑" w:hAnsi="微软雅黑" w:eastAsia="微软雅黑"/>
-          <w:b/>
-          <w:i w:val="0"/>
-          <w:color w:val="115E59"/>
-          <w:sz w:val="24"/>
-        </w:rPr>
-        <w:t>其他经历与教育</w:t>
-      </w:r>
-    </w:p>
-    <w:p>
-      <w:pPr>
-        <w:spacing w:before="0" w:after="20" w:line="269" w:lineRule="auto"/>
-      </w:pPr>
-      <w:r>
-        <w:rPr>
-          <w:rFonts w:ascii="微软雅黑" w:hAnsi="微软雅黑" w:eastAsia="微软雅黑"/>
-          <w:b w:val="0"/>
-          <w:i w:val="0"/>
-          <w:color w:val="17222A"/>
-          <w:sz w:val="19"/>
-        </w:rPr>
-        <w:t>2023.06 - 2023.08　猿辅导 · 课程顾问（暑期实习）：每周服务 60+ 客户，转化表现前 5%，月均业绩约 1.5 万。</w:t>
-      </w:r>
-    </w:p>
-    <w:p>
-      <w:pPr>
-        <w:spacing w:before="0" w:after="20" w:line="269" w:lineRule="auto"/>
-      </w:pPr>
-      <w:r>
-        <w:rPr>
-          <w:rFonts w:ascii="微软雅黑" w:hAnsi="微软雅黑" w:eastAsia="微软雅黑"/>
-          <w:b w:val="0"/>
-          <w:i w:val="0"/>
-          <w:color w:val="17222A"/>
-          <w:sz w:val="19"/>
-        </w:rPr>
-        <w:t>2021.09 - 2025.06　武汉东湖学院 · 通信工程 · 本科</w:t>
-      </w:r>
-    </w:p>
-    <w:p>
-      <w:pPr>
-        <w:spacing w:before="40" w:after="0" w:line="276" w:lineRule="auto"/>
+        <w:spacing w:before="40" w:after="0" w:line="264" w:lineRule="auto"/>
       </w:pPr>
       <w:r>
         <w:rPr>
@@ -685,14 +654,14 @@
           <w:b w:val="0"/>
           <w:i w:val="0"/>
           <w:color w:val="4A5A63"/>
-          <w:sz w:val="16"/>
+          <w:sz w:val="14"/>
         </w:rPr>
-        <w:t>【岗位关键词】IT运维、桌面运维、Windows终端运维、软件批量部署、系统异常排查、办公外设运维、Python自动化、飞书机器人API、内部网页、HTML页面、IT资产全生命周期管理、AI大模型接入、SOP标准化、知识库</w:t>
+        <w:t>【岗位关键词】IT运维、桌面运维、Windows终端运维、装机自动化、批量部署、系统异常排查、Python自动化、飞书API、内部网页、资产全生命周期管理、AI大模型接入、SOP标准化、知识库</w:t>
       </w:r>
     </w:p>
     <w:sectPr>
       <w:pgSz w:w="11906" w:h="16838"/>
-      <w:pgMar w:top="283" w:right="454" w:bottom="283" w:left="454" w:header="454" w:footer="454" w:gutter="0"/>
+      <w:pgMar w:top="227" w:right="397" w:bottom="227" w:left="397" w:header="454" w:footer="454" w:gutter="0"/>
       <w:cols w:space="720"/>
       <w:docGrid w:linePitch="360"/>
     </w:sectPr>
@@ -1069,7 +1038,7 @@
     <w:rPr>
       <w:rFonts w:ascii="微软雅黑" w:hAnsi="微软雅黑" w:eastAsia="微软雅黑"/>
       <w:b w:val="0"/>
-      <w:color w:val="17222A"/>
+      <w:color w:val="101820"/>
       <w:sz w:val="20"/>
     </w:rPr>
   </w:style>

</xml_diff>

<commit_message>
feat: optimize resume web and word layouts
</commit_message>
<xml_diff>
--- a/word/吴志勇-IT运维工程师-一页版.docx
+++ b/word/吴志勇-IT运维工程师-一页版.docx
@@ -279,6 +279,7 @@
     </w:p>
     <w:p>
       <w:pPr>
+        <w:keepNext/>
         <w:spacing w:before="40" w:after="40" w:line="264" w:lineRule="auto"/>
       </w:pPr>
       <w:r>
@@ -388,6 +389,7 @@
     </w:p>
     <w:p>
       <w:pPr>
+        <w:keepNext/>
         <w:spacing w:before="40" w:after="40" w:line="264" w:lineRule="auto"/>
       </w:pPr>
       <w:r>
@@ -430,6 +432,7 @@
     </w:p>
     <w:p>
       <w:pPr>
+        <w:keepNext/>
         <w:spacing w:before="40" w:after="40" w:line="264" w:lineRule="auto"/>
       </w:pPr>
       <w:r>
@@ -472,6 +475,7 @@
     </w:p>
     <w:p>
       <w:pPr>
+        <w:keepNext/>
         <w:spacing w:before="40" w:after="40" w:line="264" w:lineRule="auto"/>
       </w:pPr>
       <w:r>

</xml_diff>